<commit_message>
Registra preferência de entrega em Word e inclui síntese final na auditoria
Co-Authored-By: Claude Fable 5.1 <noreply@anthropic.com>
Claude-Session: https://claude.ai/code/session_01TkrAgfLLUko9vjWUcVPKkP
</commit_message>
<xml_diff>
--- a/Auditoria_PenteFino_Memoriais_AI_2186351.docx
+++ b/Auditoria_PenteFino_Memoriais_AI_2186351.docx
@@ -33796,6 +33796,173 @@
           <w:iCs w:val="false"/>
         </w:rPr>
         <w:t xml:space="preserve"> fls. 27-30, 32-38, 41-51 (só rendidas, não lidas); 116 de 119 páginas de "pag 55 a 173"; fls. 166/167; fls. 185/186 (habilitação Bradesco); fls. 205 a 900 (nenhum arquivo cobre); fls. 651; 771/785; 1500/1505 (imagem); 1924/1931 (AREsp na CP); 2140/2200 (cópias juntadas pelo Santander); 3404 (fim do acórdão); contraminuta; apelação 0017993-79.2012; sentença e acórdão dos embargos 0015252; Resolução 549/2011 e RITJSP; os seis julgados do grupo 2 de faltantes. Tudo o que está marcado 🟩 foi conferido em imagem ou em texto com camada verificada; o que está 🟨 depende desses itens.</w:t>
+      </w:r>
+    </w:p>
+    <w:p>
+      <w:pPr>
+        <w:pBdr>
+          <w:bottom w:val="single" w:color="1F3864" w:sz="6" w:space="1"/>
+        </w:pBdr>
+        <w:spacing w:after="240" w:before="120"/>
+      </w:pPr>
+    </w:p>
+    <w:p>
+      <w:pPr>
+        <w:pStyle w:val="Heading1"/>
+        <w:keepNext/>
+      </w:pPr>
+      <w:r>
+        <w:rPr>
+          <w:rFonts w:ascii="Times New Roman" w:cs="Times New Roman" w:eastAsia="Times New Roman" w:hAnsi="Times New Roman"/>
+        </w:rPr>
+        <w:t xml:space="preserve">SÍNTESE FINAL (enviada no chat em 27/09/2026)</w:t>
+      </w:r>
+    </w:p>
+    <w:p>
+      <w:pPr>
+        <w:spacing w:after="120" w:line="360"/>
+        <w:jc w:val="both"/>
+      </w:pPr>
+      <w:r>
+        <w:rPr>
+          <w:rFonts w:ascii="Times New Roman" w:cs="Times New Roman" w:eastAsia="Times New Roman" w:hAnsi="Times New Roman"/>
+          <w:b/>
+          <w:bCs/>
+          <w:i w:val="false"/>
+          <w:iCs w:val="false"/>
+        </w:rPr>
+        <w:t xml:space="preserve">Os cinco achados que mudam a estratégia</w:t>
+      </w:r>
+    </w:p>
+    <w:p>
+      <w:pPr>
+        <w:pStyle w:val="ListParagraph"/>
+        <w:numPr>
+          <w:ilvl w:val="0"/>
+          <w:numId w:val="4"/>
+        </w:numPr>
+        <w:spacing w:after="80" w:line="340"/>
+        <w:jc w:val="both"/>
+      </w:pPr>
+      <w:r>
+        <w:rPr>
+          <w:rFonts w:ascii="Times New Roman" w:cs="Times New Roman" w:eastAsia="Times New Roman" w:hAnsi="Times New Roman"/>
+          <w:b w:val="false"/>
+          <w:bCs w:val="false"/>
+          <w:i w:val="false"/>
+          <w:iCs w:val="false"/>
+        </w:rPr>
+        <w:t xml:space="preserve">🟥 A premissa "a base sempre foi a conta de 1995" não se sustenta nos autos. Todas as planilhas lidas partem de Cz$ 1.210.000,00 em maio/1987: Santander em 2007 (fls. 2137/2139 e-SAJ, CP 600/602 / 148/150 física) e 2009 (fls. 2402/2403), cessionários em 2019 (fls. 2885), 19/04/2024 (fls. 1948) e 04/06/2025 (fls. 3078). O Santander escreveu em 2007: "inobstante a existência de decisão homologada nos autos principais (…) por mera liberalidade, optou o credor" por calcular desde 1987. A única invocação da base de 1995 antes de 2026 é a resposta à exceção de 16/09/2024 (fls. 1538). O pedido de homologar R$ 185 milhões precisa ser abandonado; o pedido viável é "base de 1995 + perícia na origem".</w:t>
+      </w:r>
+    </w:p>
+    <w:p>
+      <w:pPr>
+        <w:pStyle w:val="ListParagraph"/>
+        <w:numPr>
+          <w:ilvl w:val="0"/>
+          <w:numId w:val="4"/>
+        </w:numPr>
+        <w:spacing w:after="80" w:line="340"/>
+        <w:jc w:val="both"/>
+      </w:pPr>
+      <w:r>
+        <w:rPr>
+          <w:rFonts w:ascii="Times New Roman" w:cs="Times New Roman" w:eastAsia="Times New Roman" w:hAnsi="Times New Roman"/>
+          <w:b w:val="false"/>
+          <w:bCs w:val="false"/>
+          <w:i w:val="false"/>
+          <w:iCs w:val="false"/>
+        </w:rPr>
+        <w:t xml:space="preserve">🟩 A origem dos 20% de honorários é a sentença dos Embargos à Execução (03/05/1991), e o próprio executado confessou isso (fls. 1419/1421 e-SAJ). Fls. 52 é ilegível e três documentos coevos (cédula, inicial, mandado) dizem 10%. A afirmação do agravo sobre fls. 52 deve ser retificada nos memoriais.</w:t>
+      </w:r>
+    </w:p>
+    <w:p>
+      <w:pPr>
+        <w:pStyle w:val="ListParagraph"/>
+        <w:numPr>
+          <w:ilvl w:val="0"/>
+          <w:numId w:val="4"/>
+        </w:numPr>
+        <w:spacing w:after="80" w:line="340"/>
+        <w:jc w:val="both"/>
+      </w:pPr>
+      <w:r>
+        <w:rPr>
+          <w:rFonts w:ascii="Times New Roman" w:cs="Times New Roman" w:eastAsia="Times New Roman" w:hAnsi="Times New Roman"/>
+          <w:b w:val="false"/>
+          <w:bCs w:val="false"/>
+          <w:i w:val="false"/>
+          <w:iCs w:val="false"/>
+        </w:rPr>
+        <w:t xml:space="preserve">🟩 A contradição interna de fls. 3064/3066 é literal: o juiz declarou a matéria "nova" e "imprópria a via" e, no mesmo ato, decidiu-a de ofício no item 2.</w:t>
+      </w:r>
+    </w:p>
+    <w:p>
+      <w:pPr>
+        <w:pStyle w:val="ListParagraph"/>
+        <w:numPr>
+          <w:ilvl w:val="0"/>
+          <w:numId w:val="4"/>
+        </w:numPr>
+        <w:spacing w:after="80" w:line="340"/>
+        <w:jc w:val="both"/>
+      </w:pPr>
+      <w:r>
+        <w:rPr>
+          <w:rFonts w:ascii="Times New Roman" w:cs="Times New Roman" w:eastAsia="Times New Roman" w:hAnsi="Times New Roman"/>
+          <w:b w:val="false"/>
+          <w:bCs w:val="false"/>
+          <w:i w:val="false"/>
+          <w:iCs w:val="false"/>
+        </w:rPr>
+        <w:t xml:space="preserve">🟩 A jurisprudência do STJ sobre "erro material x critério" é uniforme e favorável (EDcl e EREsp 1.229.406/SP; AgInt no REsp 2.127.021/DF; AgInt no AREsp 2.500.976/PR). Dois arquivos do Drive estão trocados: "AgInt no AgInt no AREsp 1539138" contém fls. 786/790 dos autos, e "Registro 2021-0000902160 NAO PODE COBRAR JUROS" diz o oposto do título.</w:t>
+      </w:r>
+    </w:p>
+    <w:p>
+      <w:pPr>
+        <w:pStyle w:val="ListParagraph"/>
+        <w:numPr>
+          <w:ilvl w:val="0"/>
+          <w:numId w:val="4"/>
+        </w:numPr>
+        <w:spacing w:after="80" w:line="340"/>
+        <w:jc w:val="both"/>
+      </w:pPr>
+      <w:r>
+        <w:rPr>
+          <w:rFonts w:ascii="Times New Roman" w:cs="Times New Roman" w:eastAsia="Times New Roman" w:hAnsi="Times New Roman"/>
+          <w:b w:val="false"/>
+          <w:bCs w:val="false"/>
+          <w:i w:val="false"/>
+          <w:iCs w:val="false"/>
+        </w:rPr>
+        <w:t xml:space="preserve">🟨 Ponto fraco real da conta de 1995: mora de 1% ao mês capitalizada, quando o DL 413/69, art. 5º, parágrafo único, limita a elevação a 1% ao ano. Defesa: critério preclusão, não erro material.</w:t>
+      </w:r>
+    </w:p>
+    <w:p>
+      <w:pPr>
+        <w:spacing w:after="120" w:line="360"/>
+        <w:jc w:val="both"/>
+      </w:pPr>
+      <w:r>
+        <w:rPr>
+          <w:rFonts w:ascii="Times New Roman" w:cs="Times New Roman" w:eastAsia="Times New Roman" w:hAnsi="Times New Roman"/>
+          <w:b/>
+          <w:bCs/>
+          <w:i w:val="false"/>
+          <w:iCs w:val="false"/>
+        </w:rPr>
+        <w:t xml:space="preserve">Itens pendentes para fechar os 🟨:</w:t>
+      </w:r>
+      <w:r>
+        <w:rPr>
+          <w:rFonts w:ascii="Times New Roman" w:cs="Times New Roman" w:eastAsia="Times New Roman" w:hAnsi="Times New Roman"/>
+          <w:b w:val="false"/>
+          <w:bCs w:val="false"/>
+          <w:i w:val="false"/>
+          <w:iCs w:val="false"/>
+        </w:rPr>
+        <w:t xml:space="preserve"> contraminuta; sentença e acórdão dos Embargos 0015252 (fls. ~2140/2160 e-SAJ ou fls. 32/47 e 85 dos embargos digitalizados); fls. 3404; fls. 651, 655/673, 771/785, 1924/1931 e 1500/1505; arquivo correto do AREsp 1.539.138 e os julgados 1.455.741, 1.851.737, AI 2181564-67.2026 e AI 2297076-69.2024; Apelação 0017993-79.2012; Resolução TJSP 549/2011; leitura completa de "pag 55 a 173".</w:t>
       </w:r>
     </w:p>
     <w:sectPr>
@@ -34108,6 +34275,36 @@
       </w:pPr>
     </w:lvl>
   </w:abstractNum>
+  <w:abstractNum w:abstractNumId="4" w15:restartNumberingAfterBreak="0">
+    <w:multiLevelType w:val="hybridMultilevel"/>
+    <w:lvl w:ilvl="0" w15:tentative="1">
+      <w:start w:val="1"/>
+      <w:numFmt w:val="decimal"/>
+      <w:lvlText w:val="%1."/>
+      <w:lvlJc w:val="left"/>
+      <w:pPr>
+        <w:ind w:left="567" w:hanging="360"/>
+      </w:pPr>
+    </w:lvl>
+    <w:lvl w:ilvl="1" w15:tentative="1">
+      <w:start w:val="1"/>
+      <w:numFmt w:val="lowerLetter"/>
+      <w:lvlText w:val="%2."/>
+      <w:lvlJc w:val="left"/>
+      <w:pPr>
+        <w:ind w:left="1134" w:hanging="360"/>
+      </w:pPr>
+    </w:lvl>
+    <w:lvl w:ilvl="2" w15:tentative="1">
+      <w:start w:val="1"/>
+      <w:numFmt w:val="lowerRoman"/>
+      <w:lvlText w:val="%3."/>
+      <w:lvlJc w:val="left"/>
+      <w:pPr>
+        <w:ind w:left="1701" w:hanging="360"/>
+      </w:pPr>
+    </w:lvl>
+  </w:abstractNum>
   <w:num w:numId="1">
     <w:abstractNumId w:val="1"/>
     <w:lvlOverride w:ilvl="0">
@@ -34122,6 +34319,12 @@
   </w:num>
   <w:num w:numId="3">
     <w:abstractNumId w:val="3"/>
+    <w:lvlOverride w:ilvl="0">
+      <w:startOverride w:val="1"/>
+    </w:lvlOverride>
+  </w:num>
+  <w:num w:numId="4">
+    <w:abstractNumId w:val="4"/>
     <w:lvlOverride w:ilvl="0">
       <w:startOverride w:val="1"/>
     </w:lvlOverride>

</xml_diff>